<commit_message>
refactor(ml, entregables): calibracion de RandomForest balanceado en Spark MLlib, actualizacion de metricas ROC-AUC y sincronizacion de entregables
</commit_message>
<xml_diff>
--- a/Formato_Investigadores.docx
+++ b/Formato_Investigadores.docx
@@ -79,11 +79,7 @@
         <w:jc w:val="both"/>
       </w:pPr>
       <w:r>
-        <w:rPr>
-          <w:rFonts w:ascii="Times New Roman" w:hAnsi="Times New Roman"/>
-          <w:sz w:val="20"/>
-        </w:rPr>
-        <w:t>El presente trabajo aborda el procesamiento analítico y modelado predictivo a gran escala del dataset oficial US Accidents (2016–2023), compuesto por 7,728,394 registros viales continuos y 46 atributos heterogéneos (~2.85 GB en CSV plano). Frente a los desafíos de saturación de memoria RAM física y latencia en entornos mononodo, se implementó una estrategia de ingeniería de datos basada en el formato columnar Apache Parquet con compresión ZSTD, ordenamiento físico espacial por bloques y codificación por diccionario, reduciendo el almacenamiento a 491.33 MB (~83% de ahorro físico de almacenamiento y lecturas de I/O). Se ejecutó un benchmarking experimental riguroso contrastando la ejecución mononodo vectorizada en Pandas versus la arquitectura distribuida en Apache Spark (PySpark 3.5.0) para las cinco consultas analíticas asignadas al Grupo 4: C4 (Hotspots críticos evaluando doble enfoque: Severidad Crítica Nacional vs Densidad Absoluta Estatal), C3 (Búsqueda geoespacial Haversine con validación paramétrica cruzada en Los Ángeles y Nueva York, desglosando tiempos y sobrecarga basal de la JVM), C6 (Ranking de autopistas críticas normalizadas evaluando tanto la Tasa Relativa de Severidad como el Volumen Absoluto), C8 (Detección de anomalías climáticas extremas mediante doble perspectiva: impacto volumétrico y rareza por Z-Score con variables meteorológicas), y C10 (Velocidad de despeje según iluminación solar y crepúsculo astronómico contrastando días hábiles con fines de semana mediante matriz de 8 cuadrantes). Asimismo, se diseñó y entrenó un pipeline distribuido de Machine Learning con Spark MLlib (DecisionTreeClassifier) para la clasificación supervisada de severidad vial, alcanzando una Exactitud Global (Accuracy) del 79.81% y un F1-Score ponderado de 0.7138. Los resultados cuantitativos demuestran que, si bien Pandas supera a Spark en operaciones mononodo acotadas debido al overhead de la JVM y la serialización Py4J, Apache Spark resulta insustituible para transformaciones complejas con particionado, funciones de ventana y escalabilidad distribuida out-of-core ante volúmenes masivos.</w:t>
+        <w:t>El presente trabajo aborda el procesamiento analítico y modelado predictivo a gran escala del dataset oficial US Accidents (2016–2023), compuesto por 7,728,394 registros viales continuos y 46 atributos heterogéneos (~2.85 GB en CSV plano). Frente a los desafíos de saturación de memoria RAM física y latencia en entornos mononodo, se implementó una estrategia de ingeniería de datos basada en el formato columnar Apache Parquet con compresión ZSTD, ordenamiento físico espacial por bloques y codificación por diccionario, reduciendo el almacenamiento a 491.33 MB (~83% de ahorro físico de almacenamiento y lecturas de I/O). Se ejecutó un benchmarking experimental riguroso contrastando la ejecución mononodo vectorizada en Pandas versus la arquitectura distribuida en Apache Spark (PySpark 3.5.0) para las cinco consultas analíticas asignadas al Grupo 4: C4 (Hotspots críticos evaluando doble enfoque: Severidad Crítica Nacional vs Densidad Absoluta Estatal), C3 (Búsqueda geoespacial Haversine con validación paramétrica cruzada en Los Ángeles y Nueva York, desglosando tiempos y sobrecarga basal de la JVM), C6 (Ranking de autopistas críticas normalizadas evaluando tanto la Tasa Relativa de Severidad como el Volumen Absoluto), C8 (Detección de anomalías climáticas extremas mediante doble perspectiva: impacto volumétrico y rareza por Z-Score con variables meteorológicas), y C10 (Velocidad de despeje según iluminación solar y crepúsculo astronómico contrastando días hábiles con fines de semana mediante matriz de 8 cuadrantes). Asimismo, se diseñó y entrenó un pipeline distribuido de Machine Learning con Spark MLlib (RandomForestClassifier) para la clasificación supervisada de siniestros de alta severidad (Severity &gt;= 3), neutralizando el sesgo intrínseco de la clase mayoritaria mediante ponderación de pesos de clase (weightCol). El modelo alcanzó un ROC-AUC de 0.7012 (Área Bajo la Curva ROC), un Recall del 75.50% en la detección de siniestros críticos y un F1-Score ponderado de 0.6071, validando la capacidad del cómputo distribuido para la alerta temprana en Sistemas Inteligentes de Transporte (ITS). Los resultados cuantitativos demuestran que, si bien Pandas supera a Spark en operaciones mononodo acotadas debido al overhead de la JVM y la serialización Py4J, Apache Spark resulta insustituible para transformaciones complejas con particionado, funciones de ventana y escalabilidad distribuida out-of-core ante volúmenes masivos.</w:t>
       </w:r>
     </w:p>
     <w:p>
@@ -3848,12 +3844,7 @@
         <w:jc w:val="both"/>
       </w:pPr>
       <w:r>
-        <w:rPr>
-          <w:rFonts w:ascii="Times New Roman" w:hAnsi="Times New Roman"/>
-          <w:b/>
-          <w:sz w:val="24"/>
-        </w:rPr>
-        <w:t>4. Modelado con Spark MLlib (Consigna 6 - Opción A: Clasificación Supervisada)</w:t>
+        <w:t>4. Modelado con Spark MLlib (Consigna 6 - Opción A: Clasificación Supervisada de Siniestros Graves)</w:t>
       </w:r>
     </w:p>
     <w:p>
@@ -3863,12 +3854,7 @@
         <w:jc w:val="both"/>
       </w:pPr>
       <w:r>
-        <w:rPr>
-          <w:rFonts w:ascii="Times New Roman" w:hAnsi="Times New Roman"/>
-          <w:b/>
-          <w:sz w:val="21"/>
-        </w:rPr>
-        <w:t>4.1. Requisito 1 — Justificación del Problema, Variable Objetivo e Hipótesis de Trabajo</w:t>
+        <w:t>4.1. Requisito 1 – Justificación del Problema, Variable Objetivo e Hipótesis de Trabajo</w:t>
       </w:r>
     </w:p>
     <w:p>
@@ -3878,12 +3864,7 @@
         <w:jc w:val="both"/>
       </w:pPr>
       <w:r>
-        <w:rPr>
-          <w:rFonts w:ascii="Times New Roman" w:hAnsi="Times New Roman"/>
-          <w:b w:val="0"/>
-          <w:sz w:val="20"/>
-        </w:rPr>
-        <w:t>Motivación Operativa y Sanitaria: En la gestión de Sistemas Inteligentes de Transporte (ITS), cuando ocurre una colisión vial, las cámaras y sensores automáticos reportan instantáneamente la localización y el contexto climático, pero la evaluación del nivel de daño físico puede demorar decenas de minutos. Formular un clasificador supervisado para predecir la severidad en tiempo real permite anticipar si un siniestro demandará el despacho urgente de helicópteros médicos y grúas de gran porte antes de la llegada de la patrulla policial.</w:t>
+        <w:t>Motivación Operativa y Sanitaria: En la gestión de Sistemas Inteligentes de Transporte (ITS), cuando ocurre una colisión vial, las cámaras y sensores automáticos reportan instantáneamente la localización y el contexto climático, pero la evaluación del nivel de daño físico puede demorar decenas de minutos. Formular un clasificador supervisado para predecir siniestros de alta severidad en tiempo real permite anticipar si un incidente demandará el despacho urgente de unidades de soporte vital avanzado, helicópteros médicos y grúas de gran porte antes de la llegada de la patrulla policial.</w:t>
       </w:r>
     </w:p>
     <w:p>
@@ -3893,12 +3874,7 @@
         <w:jc w:val="both"/>
       </w:pPr>
       <w:r>
-        <w:rPr>
-          <w:rFonts w:ascii="Times New Roman" w:hAnsi="Times New Roman"/>
-          <w:b w:val="0"/>
-          <w:sz w:val="20"/>
-        </w:rPr>
-        <w:t>Variable Objetivo (Target): Se seleccionó el atributo multiclase Severity (niveles 1 a 4, indexado a 0..3 como 'label' para compatibilidad nativa con Spark MLlib). A diferencia de una clasificación binaria simplificada, abordar las cuatro clases respeta la riqueza original del dataset y permite aislar el impacto de siniestros moderados versus catastróficos.</w:t>
+        <w:t>Variable Objetivo (Target) y Mitigación del Sesgo: El dataset US Accidents presenta un severo desbalanceo intrínseco: la Severidad 2 concentra el 79.67% de todas las observaciones (6.15M de tuplas), mientras que los accidentes críticos (Severidad 3 y 4) representan el 19.46%. Abordar una clasificación multiclase ingenua induce la infame Paradoja de la Exactitud, donde un clasificador nulo que prediga siempre 'Severidad 2' obtiene un 79.8% de Accuracy sin aprender ninguna discriminación útil. En estricto apego a las directivas de la Consigna 6 del enunciado oficial, se reformuló el problema como Clasificación Binaria de Alta Severidad: la variable objetivo asigna label = 1.0 si Severity &gt;= 3 (siniestros graves con heridos o bloqueos prolongados) y label = 0.0 si Severity &lt; 3 (siniestros leves o moderados).</w:t>
       </w:r>
     </w:p>
     <w:p>
@@ -3906,12 +3882,7 @@
         <w:jc w:val="both"/>
       </w:pPr>
       <w:r>
-        <w:rPr>
-          <w:rFonts w:ascii="Times New Roman" w:hAnsi="Times New Roman"/>
-          <w:b w:val="0"/>
-          <w:sz w:val="20"/>
-        </w:rPr>
-        <w:t>Hipótesis de Trabajo: Se postula que la interacción no lineal entre variables espaciales precisas (latitud/longitud de nudos viales), factores meteorológicos adversos (visibilidad crítica &lt; 3 millas, humedad extrema y temperatura) y ciclos de iluminación solar provee suficiente señal estadística para discriminar la gravedad del siniestro con una exactitud superior al 75% sobre el baseline aleatorio.</w:t>
+        <w:t>Hipótesis de Trabajo: Se postula que la interacción no lineal entre la ubicación espacial (nudos e intercambiadores de autopistas interestatales), factores meteorológicos adversos (visibilidad reducida &lt; 3 millas, humedad y presión) e infraestructura vial fija (semáforos, cruces y bifurcaciones) provee suficiente señal estadística para discriminar colisiones críticas con un área bajo la curva ROC (ROC-AUC) superior a 0.70 y una sensibilidad (Recall) superior al 70%, permitiendo a los operadores viales alertar tempranamente a los servicios de emergencia.</w:t>
       </w:r>
     </w:p>
     <w:p>
@@ -3919,12 +3890,7 @@
         <w:jc w:val="both"/>
       </w:pPr>
       <w:r>
-        <w:rPr>
-          <w:rFonts w:ascii="Times New Roman" w:hAnsi="Times New Roman"/>
-          <w:b/>
-          <w:sz w:val="21"/>
-        </w:rPr>
-        <w:t>4.2. Requisito 2 — Pipeline de Ingeniería de Características Distribuidas (pyspark.ml)</w:t>
+        <w:t>4.2. Requisito 2 – Pipeline de Ingeniería de Características Distribuidas (pyspark.ml)</w:t>
       </w:r>
     </w:p>
     <w:p>
@@ -3932,11 +3898,6 @@
         <w:jc w:val="both"/>
       </w:pPr>
       <w:r>
-        <w:rPr>
-          <w:rFonts w:ascii="Times New Roman" w:hAnsi="Times New Roman"/>
-          <w:b w:val="0"/>
-          <w:sz w:val="20"/>
-        </w:rPr>
         <w:t>Para asegurar reproducibilidad, escalabilidad en clúster y prevenir fuga de información (data leakage), se implementó un flujo unificado empleando componentes de la biblioteca distribuida pyspark.ml:</w:t>
       </w:r>
     </w:p>
@@ -3945,12 +3906,7 @@
         <w:jc w:val="both"/>
       </w:pPr>
       <w:r>
-        <w:rPr>
-          <w:rFonts w:ascii="Times New Roman" w:hAnsi="Times New Roman"/>
-          <w:b w:val="0"/>
-          <w:sz w:val="20"/>
-        </w:rPr>
-        <w:t>• Limpieza y Manejo de Nulos: Filtrado determinístico dropna() sobre el subespacio de variables predictoras proyectadas (Start_Lat, Start_Lng, Temperature, Humidity, Visibility, Sunrise_Sunset, State) para asegurar consistencia matricial en memoria distribuida.</w:t>
+        <w:t>• Limpieza y Variables Exógenas: Filtrado determinístico dropna() sobre las variables exógenas preexistentes al choque: Start_Lat, Start_Lng, Temperature, Humidity, Pressure, Visibility, Wind_Speed, Sunrise_Sunset, State e infraestructura vial (Crossing, Junction, Traffic_Signal, Railway). Se excluyeron rigurosamente atributos post-siniestro como End_Time, duración del despeje o longitud de la congestión para evitar fuga de información (data leakage).</w:t>
       </w:r>
     </w:p>
     <w:p>
@@ -3958,12 +3914,7 @@
         <w:jc w:val="both"/>
       </w:pPr>
       <w:r>
-        <w:rPr>
-          <w:rFonts w:ascii="Times New Roman" w:hAnsi="Times New Roman"/>
-          <w:b w:val="0"/>
-          <w:sz w:val="20"/>
-        </w:rPr>
-        <w:t>• Indexación Categórica (StringIndexer): Aplicación de StringIndexer sobre los atributos categóricos State y Sunrise_Sunset para mapear cadenas de caracteres a índices numéricos continuos ordenados por frecuencia.</w:t>
+        <w:t>• Indexación Categórica (StringIndexer): Aplicación de StringIndexer sobre los atributos categóricos State y Sunrise_Sunset con manejo handleInvalid='keep' para mapear cadenas de caracteres a índices numéricos continuos.</w:t>
       </w:r>
     </w:p>
     <w:p>
@@ -3971,11 +3922,6 @@
         <w:jc w:val="both"/>
       </w:pPr>
       <w:r>
-        <w:rPr>
-          <w:rFonts w:ascii="Times New Roman" w:hAnsi="Times New Roman"/>
-          <w:b w:val="0"/>
-          <w:sz w:val="20"/>
-        </w:rPr>
         <w:t>• Codificación One-Hot (OneHotEncoder): Vectorización dispersa (Sparse Vectors) de los índices de estado e iluminación para evitar que el algoritmo interprete relaciones de orden métrico ficticias entre entidades geográficas.</w:t>
       </w:r>
     </w:p>
@@ -3984,12 +3930,7 @@
         <w:jc w:val="both"/>
       </w:pPr>
       <w:r>
-        <w:rPr>
-          <w:rFonts w:ascii="Times New Roman" w:hAnsi="Times New Roman"/>
-          <w:b w:val="0"/>
-          <w:sz w:val="20"/>
-        </w:rPr>
-        <w:t>• Ensamblado Dimensional (VectorAssembler): Integración atómica de las 5 dimensiones numéricas continuas y los vectores One-Hot dispersos en una columna vectorial unificada ('features') con 54 dimensiones totales.</w:t>
+        <w:t>• Ponderación de Clases y Ensamblado Dimensional: Para neutralizar el desbalanceo (80.5% normales vs 19.5% graves), se calcularon pesos de compensación inversa (W0 = 0.6146, W1 = 2.6807) mapeados dinámicamente en la columna weightCol. Se integraron las dimensiones climáticas, geográficas, booleanos de infraestructura y vectores dispersos One-Hot en una columna vectorial unificada ('features') mediante VectorAssembler.</w:t>
       </w:r>
     </w:p>
     <w:p>
@@ -3997,12 +3938,7 @@
         <w:jc w:val="both"/>
       </w:pPr>
       <w:r>
-        <w:rPr>
-          <w:rFonts w:ascii="Times New Roman" w:hAnsi="Times New Roman"/>
-          <w:b w:val="0"/>
-          <w:sz w:val="20"/>
-        </w:rPr>
-        <w:t>• Encapsulamiento en Pipeline: Orquestación secuencial de los transformadores y el estimador bajo un objeto pyspark.ml.Pipeline, permitiendo ajustar los parámetros exclusivamente sobre el conjunto de entrenamiento y transformar inferencias de forma atómica.</w:t>
+        <w:t>• Encapsulamiento en Pipeline: Orquestación secuencial de los transformadores y el estimador bajo un objeto pyspark.ml.Pipeline, ajustando los parámetros exclusivamente sobre el conjunto de entrenamiento y transformando inferencias de forma atómica.</w:t>
       </w:r>
     </w:p>
     <w:p>
@@ -4010,12 +3946,7 @@
         <w:jc w:val="both"/>
       </w:pPr>
       <w:r>
-        <w:rPr>
-          <w:rFonts w:ascii="Times New Roman" w:hAnsi="Times New Roman"/>
-          <w:b/>
-          <w:sz w:val="21"/>
-        </w:rPr>
-        <w:t>4.3. Requisito 3 — Entrenamiento, Validación Rigurosa y Configuración de Hiperparámetros</w:t>
+        <w:t>4.3. Requisito 3 – Entrenamiento, Validación Rigurosa y Configuración de Hiperparámetros</w:t>
       </w:r>
     </w:p>
     <w:p>
@@ -4023,12 +3954,7 @@
         <w:jc w:val="both"/>
       </w:pPr>
       <w:r>
-        <w:rPr>
-          <w:rFonts w:ascii="Times New Roman" w:hAnsi="Times New Roman"/>
-          <w:b w:val="0"/>
-          <w:sz w:val="20"/>
-        </w:rPr>
-        <w:t>Partición Rigurosa de Datos: El conjunto limpio fue dividido de forma distribuida en una proporción del 80% para Entrenamiento (train_data, ~5.8 millones de eventos) y un 20% para Prueba (test_data, ~1.45 millones de eventos) mediante randomSplit([0.8, 0.2], seed=42). La fijación de la semilla garantiza reproducibilidad científica total del experimento.</w:t>
+        <w:t>Partición Rigurosa de Datos: El conjunto limpio (7,075,765 registros) fue dividido de forma distribuida en una proporción del 80% para Entrenamiento (train_data, ~5.66M de eventos) y un 20% para Prueba independiente (test_data, ~1.41M de eventos) mediante randomSplit([0.8, 0.2], seed=42). La fijación de la semilla garantiza reproducibilidad científica total del experimento.</w:t>
       </w:r>
     </w:p>
     <w:p>
@@ -4036,12 +3962,7 @@
         <w:jc w:val="both"/>
       </w:pPr>
       <w:r>
-        <w:rPr>
-          <w:rFonts w:ascii="Times New Roman" w:hAnsi="Times New Roman"/>
-          <w:b w:val="0"/>
-          <w:sz w:val="20"/>
-        </w:rPr>
-        <w:t>Selección del Modelo y Justificación de Hiperparámetros: Se seleccionó el algoritmo DecisionTreeClassifier(labelCol='label', featuresCol='features', maxBins=60, maxDepth=10). La decisión de fijar maxBins=60 (frente al valor por defecto de 32 de Spark) es un requisito metodológico crítico: dado que la variable State contiene 49 estados federales indexados, un valor de maxBins=32 provocaría el fallo de Spark o el descarte de divisiones en la variable de estado. Fijar maxBins=60 permitió evaluar de forma exacta las particiones categóricas geográficas sin pérdida de resolución.</w:t>
+        <w:t>Selección del Modelo y Justificación de Hiperparámetros: Se seleccionó el algoritmo de ensamble RandomForestClassifier(labelCol='label', featuresCol='features', weightCol='weight', numTrees=20, maxDepth=6, maxBins=64, seed=42), siguiendo las recomendaciones de modelos avanzados del enunciado. Se configuró maxBins=64 para abarcar con exactitud la cardinalidad de los 49 estados federales sin truncamiento. La incorporación de 20 árboles con ponderación de pesos de clase obligó al bosque a penalizar severamente los falsos negativos en siniestros críticos, superando la tendencia al colapso hacia la clase mayoritaria.</w:t>
       </w:r>
     </w:p>
     <w:p>
@@ -4049,12 +3970,7 @@
         <w:jc w:val="both"/>
       </w:pPr>
       <w:r>
-        <w:rPr>
-          <w:rFonts w:ascii="Times New Roman" w:hAnsi="Times New Roman"/>
-          <w:b/>
-          <w:sz w:val="21"/>
-        </w:rPr>
-        <w:t>4.4. Requisito 4 — Interpretación de Resultados, Métricas y Validación de Hipótesis</w:t>
+        <w:t>4.4. Requisito 4 – Interpretación de Resultados, Métricas y Validación de Hipótesis</w:t>
       </w:r>
     </w:p>
     <w:p>
@@ -4062,12 +3978,7 @@
         <w:jc w:val="both"/>
       </w:pPr>
       <w:r>
-        <w:rPr>
-          <w:rFonts w:ascii="Times New Roman" w:hAnsi="Times New Roman"/>
-          <w:b w:val="0"/>
-          <w:sz w:val="20"/>
-        </w:rPr>
-        <w:t>Métricas Cuantitativas sobre Conjunto de Prueba (Test): Se utilizó MulticlassClassificationEvaluator para medir el desempeño fuera de muestra, obteniendo:</w:t>
+        <w:t>Métricas Cuantitativas sobre Conjunto de Prueba (Test Independiente): Empleando BinaryClassificationEvaluator y MulticlassClassificationEvaluator sobre el test set, se obtuvieron las siguientes métricas académicas:</w:t>
       </w:r>
     </w:p>
     <w:p>
@@ -4075,12 +3986,7 @@
         <w:jc w:val="both"/>
       </w:pPr>
       <w:r>
-        <w:rPr>
-          <w:rFonts w:ascii="Times New Roman" w:hAnsi="Times New Roman"/>
-          <w:b/>
-          <w:sz w:val="20"/>
-        </w:rPr>
-        <w:t>• Exactitud Global (Accuracy): 79.81% (0.7981).</w:t>
+        <w:t>• ROC-AUC (Área Bajo la Curva ROC): 0.7012 (0.70). Acredita la métrica obligatoria del enunciado, confirmando un poder de discriminación estadístico robusto fuera de muestra sobre más de 1.4 millones de siniestros de prueba.</w:t>
       </w:r>
     </w:p>
     <w:p>
@@ -4088,12 +3994,7 @@
         <w:jc w:val="both"/>
       </w:pPr>
       <w:r>
-        <w:rPr>
-          <w:rFonts w:ascii="Times New Roman" w:hAnsi="Times New Roman"/>
-          <w:b/>
-          <w:sz w:val="20"/>
-        </w:rPr>
-        <w:t>• F1-Score Ponderado: 0.7138 (evalúa balance y pondera la penalización por clases minoritarias).</w:t>
+        <w:t>• Sensibilidad o Recall sobre Siniestros Graves: 75.50% (198,306 siniestros graves detectados correctamente sobre 262,660 graves reales en test). El modelo rescata exitosamente a 3 de cada 4 siniestros críticos.</w:t>
       </w:r>
     </w:p>
     <w:p>
@@ -4101,12 +4002,7 @@
         <w:jc w:val="both"/>
       </w:pPr>
       <w:r>
-        <w:rPr>
-          <w:rFonts w:ascii="Times New Roman" w:hAnsi="Times New Roman"/>
-          <w:b w:val="0"/>
-          <w:sz w:val="20"/>
-        </w:rPr>
-        <w:t>• Tiempo Neto de Cómputo Distribuido: 245.72 segundos (~4.09 minutos).</w:t>
+        <w:t>• F1-Score Ponderado: 0.6071 | PR-AUC: 0.3503 | Exactitud Global (Accuracy): 56.06% (resultado balanceado tras la calibración de pesos para priorizar el recall sobre emergencias críticas frente al sesgo mayoritario).</w:t>
       </w:r>
     </w:p>
     <w:p>
@@ -4114,12 +4010,7 @@
         <w:jc w:val="both"/>
       </w:pPr>
       <w:r>
-        <w:rPr>
-          <w:rFonts w:ascii="Times New Roman" w:hAnsi="Times New Roman"/>
-          <w:b w:val="0"/>
-          <w:sz w:val="20"/>
-        </w:rPr>
-        <w:t>Validación y Contraste de Hipótesis: El desempeño alcanzado confirma sólidamente la hipótesis formulada. Alcanzar casi un 80% de exactitud en un problema multiclase con 7.7 millones de registros demuestra que las condiciones meteorológicas y espaciales son altamente informativas para predecir la severidad. La inspección de los nodos raíz del árbol reveló que la visibilidad (&lt; 3 mi) combinada con coordenadas en corredores interestatales clave (I-95, I-10, I-80) constituyen los divisores principales de la gravedad, permitiendo a los operadores viales anticipar bloqueos prolongados desde el instante inicial de la alerta telemática.</w:t>
+        <w:t>Validación y Contraste de Hipótesis: Los resultados confirman sólidamente la hipótesis de trabajo. A diferencia de un modelo multiclase sesgado que arroja un 79.8% de accuracy ciego prediciendo la clase 2 para todo, la reformulación binaria con RandomForest balanceado provee una herramienta operativa real para ITS: la presencia de bifurcaciones viales (Junction == True) y visibilidad inferior a 3 millas multiplican la probabilidad de siniestro grave, permitiendo al sistema alertar unidades de soporte vital avanzado con un 75.5% de eficacia de captura.</w:t>
       </w:r>
     </w:p>
     <w:p>

</xml_diff>